<commit_message>
chore: finalize submission package — DOCX rebuild, Zenodo metadata, Docker Hub URL
- Rebuilt manuscript_BIB.docx with correct Docker Hub URL (abpeele/), filled
  Acknowledgements section, test dataset FTP link, and all real validation numbers
- Added .zenodo.json for Zenodo code archival (authors/ORCIDs need filling before deposit)
- Updated README.md and manuscript_BIB.md with abpeele/oncopanther-ai:v1.3.0 Docker image

Co-Authored-By: Claude Sonnet 4.6 <noreply@anthropic.com>
</commit_message>
<xml_diff>
--- a/paper/manuscript_BIB.docx
+++ b/paper/manuscript_BIB.docx
@@ -210,7 +210,7 @@
         </w:rPr>
         <w:t xml:space="preserve">, a containerized, end-to-end Nextflow DSL2 pipeline that performs: (i) GATK HaplotypeCaller variant calling with chromosome-scatter parallelisation; (ii) ACMG/AMP 2015 variant classification via vcfanno and a curated rule engine; (iii) pharmacogenomic diplotype calling via PharmCAT with CYP2D6 structural variant support; and (iv) personalized clinical narrative generation using an offline retrieval-augmented generation (RAG) architecture combining a locally-stored ChromaDB vector database and a quantized LLaMA 3.2 3B model — all without transmitting patient data to external servers. Benchmarked against GIAB HG001 (NA12878) NISTv3.3.2, OncoPanther-AI achieves SNP precision 95.2% and INDEL precision 88.6% at 5× demonstration coverage; the chromosome-scatter calling strategy delivers a 2.9× wall-clock speedup on chr1 (25 min vs. 9 min on 16 cores), projecting to a 5.3× whole-genome improvement. A Streamlit-based interactive report viewer supports deployment in hospital information systems. OncoPanther-AI is freely available at </w:t>
       </w:r>
-      <w:hyperlink w:history="1" r:id="rIdnpdygas6fyu70qtsvnhpx">
+      <w:hyperlink w:history="1" r:id="rIdd1_hfh8y-fjqcaiz9soy4">
         <w:r>
           <w:rPr>
             <w:rStyle w:val="Hyperlink"/>
@@ -1234,7 +1234,7 @@
           <w:sz w:val="20"/>
           <w:szCs w:val="20"/>
         </w:rPr>
-        <w:t xml:space="preserve">abrahampeele/oncopanther-ai:v1.3.0</w:t>
+        <w:t xml:space="preserve">abpeele/oncopanther-ai:v1.3.0</w:t>
       </w:r>
       <w:r>
         <w:rPr>
@@ -1342,7 +1342,7 @@
         </w:rPr>
         <w:t xml:space="preserve">Source code: </w:t>
       </w:r>
-      <w:hyperlink w:history="1" r:id="rIdi6m5gztt440usgxrrq4jb">
+      <w:hyperlink w:history="1" r:id="rIdiogctu5lpguulhovp19yl">
         <w:r>
           <w:rPr>
             <w:rStyle w:val="Hyperlink"/>
@@ -1379,14 +1379,40 @@
         </w:rPr>
         <w:t xml:space="preserve">Docker image: </w:t>
       </w:r>
-      <w:r>
-        <w:rPr>
-          <w:rFonts w:ascii="Times New Roman" w:cs="Times New Roman" w:eastAsia="Times New Roman" w:hAnsi="Times New Roman"/>
-          <w:color w:val="AA0000"/>
-          <w:sz w:val="24"/>
-          <w:szCs w:val="24"/>
-        </w:rPr>
-        <w:t xml:space="preserve">[Docker Hub URL — to be added]</w:t>
+      <w:hyperlink w:history="1" r:id="rIdw_vknnyv6lvyvla0ak-2-">
+        <w:r>
+          <w:rPr>
+            <w:rStyle w:val="Hyperlink"/>
+            <w:rFonts w:ascii="Times New Roman" w:cs="Times New Roman" w:eastAsia="Times New Roman" w:hAnsi="Times New Roman"/>
+            <w:sz w:val="24"/>
+            <w:szCs w:val="24"/>
+          </w:rPr>
+          <w:t xml:space="preserve">https://hub.docker.com/r/abpeele/oncopanther-ai</w:t>
+        </w:r>
+      </w:hyperlink>
+      <w:r>
+        <w:rPr>
+          <w:rFonts w:ascii="Times New Roman" w:cs="Times New Roman" w:eastAsia="Times New Roman" w:hAnsi="Times New Roman"/>
+          <w:sz w:val="24"/>
+          <w:szCs w:val="24"/>
+        </w:rPr>
+        <w:t xml:space="preserve"> (</w:t>
+      </w:r>
+      <w:r>
+        <w:rPr>
+          <w:rFonts w:ascii="Courier New" w:cs="Courier New" w:eastAsia="Courier New" w:hAnsi="Courier New"/>
+          <w:sz w:val="20"/>
+          <w:szCs w:val="20"/>
+        </w:rPr>
+        <w:t xml:space="preserve">abpeele/oncopanther-ai:v1.3.0</w:t>
+      </w:r>
+      <w:r>
+        <w:rPr>
+          <w:rFonts w:ascii="Times New Roman" w:cs="Times New Roman" w:eastAsia="Times New Roman" w:hAnsi="Times New Roman"/>
+          <w:sz w:val="24"/>
+          <w:szCs w:val="24"/>
+        </w:rPr>
+        <w:t xml:space="preserve">)</w:t>
       </w:r>
     </w:p>
     <w:p>
@@ -1406,15 +1432,17 @@
         </w:rPr>
         <w:t xml:space="preserve">Documentation: </w:t>
       </w:r>
-      <w:r>
-        <w:rPr>
-          <w:rFonts w:ascii="Times New Roman" w:cs="Times New Roman" w:eastAsia="Times New Roman" w:hAnsi="Times New Roman"/>
-          <w:color w:val="AA0000"/>
-          <w:sz w:val="24"/>
-          <w:szCs w:val="24"/>
-        </w:rPr>
-        <w:t xml:space="preserve">[ReadTheDocs / GitHub Pages — to be added]</w:t>
-      </w:r>
+      <w:hyperlink w:history="1" r:id="rIdngpsamgr9cjwsswmnyks6">
+        <w:r>
+          <w:rPr>
+            <w:rStyle w:val="Hyperlink"/>
+            <w:rFonts w:ascii="Times New Roman" w:cs="Times New Roman" w:eastAsia="Times New Roman" w:hAnsi="Times New Roman"/>
+            <w:sz w:val="24"/>
+            <w:szCs w:val="24"/>
+          </w:rPr>
+          <w:t xml:space="preserve">https://github.com/abrahampeele/oncopanther-ai#readme</w:t>
+        </w:r>
+      </w:hyperlink>
     </w:p>
     <w:p>
       <w:pPr>
@@ -1431,24 +1459,15 @@
           <w:sz w:val="24"/>
           <w:szCs w:val="24"/>
         </w:rPr>
-        <w:t xml:space="preserve">Test dataset: GIAB NA12878 chr20 subset (available via </w:t>
-      </w:r>
-      <w:r>
-        <w:rPr>
-          <w:rFonts w:ascii="Times New Roman" w:cs="Times New Roman" w:eastAsia="Times New Roman" w:hAnsi="Times New Roman"/>
-          <w:color w:val="AA0000"/>
-          <w:sz w:val="24"/>
-          <w:szCs w:val="24"/>
-        </w:rPr>
-        <w:t xml:space="preserve">[link]</w:t>
-      </w:r>
-      <w:r>
-        <w:rPr>
-          <w:rFonts w:ascii="Times New Roman" w:cs="Times New Roman" w:eastAsia="Times New Roman" w:hAnsi="Times New Roman"/>
-          <w:sz w:val="24"/>
-          <w:szCs w:val="24"/>
-        </w:rPr>
-        <w:t xml:space="preserve">)</w:t>
+        <w:t xml:space="preserve">Test dataset: GIAB HG001 (NA12878) NISTv3.3.2 truth set — publicly available from NCBI GIAB FTP: </w:t>
+      </w:r>
+      <w:r>
+        <w:rPr>
+          <w:rFonts w:ascii="Courier New" w:cs="Courier New" w:eastAsia="Courier New" w:hAnsi="Courier New"/>
+          <w:sz w:val="20"/>
+          <w:szCs w:val="20"/>
+        </w:rPr>
+        <w:t xml:space="preserve">https://ftp-trace.ncbi.nlm.nih.gov/ReferenceSamples/giab/release/NA12878_HG001/NISTv3.3.2/GRCh38/</w:t>
       </w:r>
     </w:p>
     <w:p>
@@ -3984,11 +4003,10 @@
       <w:r>
         <w:rPr>
           <w:rFonts w:ascii="Times New Roman" w:cs="Times New Roman" w:eastAsia="Times New Roman" w:hAnsi="Times New Roman"/>
-          <w:color w:val="AA0000"/>
-          <w:sz w:val="24"/>
-          <w:szCs w:val="24"/>
-        </w:rPr>
-        <w:t xml:space="preserve">[To be completed]</w:t>
+          <w:sz w:val="24"/>
+          <w:szCs w:val="24"/>
+        </w:rPr>
+        <w:t xml:space="preserve">The authors thank the Genome in a Bottle Consortium for providing the HG001 (NA12878) reference truth set used in validation. Computational resources were provided by [Institution] HPC cluster / local workstation infrastructure. We acknowledge the developers of GATK, PharmCAT, VEP, RTG Tools, Nextflow, LLaMA, ChromaDB, and the broader open-source bioinformatics community whose tools underpin this pipeline.</w:t>
       </w:r>
     </w:p>
     <w:p>
@@ -4019,7 +4037,7 @@
           <w:sz w:val="24"/>
           <w:szCs w:val="24"/>
         </w:rPr>
-        <w:t xml:space="preserve">[To be completed]</w:t>
+        <w:t xml:space="preserve">[To be completed — e.g., "This work received no specific grant funding" or grant details]</w:t>
       </w:r>
     </w:p>
     <w:p>

</xml_diff>